<commit_message>
add solution for topic_01
</commit_message>
<xml_diff>
--- a/TP-KB-252-Vlad-Baklazhko-lpr.docx
+++ b/TP-KB-252-Vlad-Baklazhko-lpr.docx
@@ -1,6 +1,6 @@
 
 <file path=word/document.xml><?xml version="1.0" encoding="utf-8"?>
-<w:document xmlns:wpc="http://schemas.microsoft.com/office/word/2010/wordprocessingCanvas" xmlns:cx="http://schemas.microsoft.com/office/drawing/2014/chartex" xmlns:cx1="http://schemas.microsoft.com/office/drawing/2015/9/8/chartex" xmlns:cx2="http://schemas.microsoft.com/office/drawing/2015/10/21/chartex" xmlns:cx3="http://schemas.microsoft.com/office/drawing/2016/5/9/chartex" xmlns:cx4="http://schemas.microsoft.com/office/drawing/2016/5/10/chartex" xmlns:cx5="http://schemas.microsoft.com/office/drawing/2016/5/11/chartex" xmlns:cx6="http://schemas.microsoft.com/office/drawing/2016/5/12/chartex" xmlns:cx7="http://schemas.microsoft.com/office/drawing/2016/5/13/chartex" xmlns:cx8="http://schemas.microsoft.com/office/drawing/2016/5/14/chartex" xmlns:mc="http://schemas.openxmlformats.org/markup-compatibility/2006" xmlns:aink="http://schemas.microsoft.com/office/drawing/2016/ink" xmlns:am3d="http://schemas.microsoft.com/office/drawing/2017/model3d" xmlns:o="urn:schemas-microsoft-com:office:office" xmlns:oel="http://schemas.microsoft.com/office/2019/extlst" xmlns:r="http://schemas.openxmlformats.org/officeDocument/2006/relationships" xmlns:m="http://schemas.openxmlformats.org/officeDocument/2006/math" xmlns:v="urn:schemas-microsoft-com:vml" xmlns:wp14="http://schemas.microsoft.com/office/word/2010/wordprocessingDrawing" xmlns:wp="http://schemas.openxmlformats.org/drawingml/2006/wordprocessingDrawing" xmlns:w10="urn:schemas-microsoft-com:office:word" xmlns:w="http://schemas.openxmlformats.org/wordprocessingml/2006/main" xmlns:w14="http://schemas.microsoft.com/office/word/2010/wordml" xmlns:w15="http://schemas.microsoft.com/office/word/2012/wordml" xmlns:w16cex="http://schemas.microsoft.com/office/word/2018/wordml/cex" xmlns:w16cid="http://schemas.microsoft.com/office/word/2016/wordml/cid" xmlns:w16="http://schemas.microsoft.com/office/word/2018/wordml" xmlns:w16sdtdh="http://schemas.microsoft.com/office/word/2020/wordml/sdtdatahash" xmlns:w16se="http://schemas.microsoft.com/office/word/2015/wordml/symex" xmlns:wpg="http://schemas.microsoft.com/office/word/2010/wordprocessingGroup" xmlns:wpi="http://schemas.microsoft.com/office/word/2010/wordprocessingInk" xmlns:wne="http://schemas.microsoft.com/office/word/2006/wordml" xmlns:wps="http://schemas.microsoft.com/office/word/2010/wordprocessingShape" mc:Ignorable="w14 w15 w16se w16cid w16 w16cex w16sdtdh wp14">
+<w:document xmlns:wpc="http://schemas.microsoft.com/office/word/2010/wordprocessingCanvas" xmlns:cx="http://schemas.microsoft.com/office/drawing/2014/chartex" xmlns:cx1="http://schemas.microsoft.com/office/drawing/2015/9/8/chartex" xmlns:cx2="http://schemas.microsoft.com/office/drawing/2015/10/21/chartex" xmlns:cx3="http://schemas.microsoft.com/office/drawing/2016/5/9/chartex" xmlns:cx4="http://schemas.microsoft.com/office/drawing/2016/5/10/chartex" xmlns:cx5="http://schemas.microsoft.com/office/drawing/2016/5/11/chartex" xmlns:cx6="http://schemas.microsoft.com/office/drawing/2016/5/12/chartex" xmlns:cx7="http://schemas.microsoft.com/office/drawing/2016/5/13/chartex" xmlns:cx8="http://schemas.microsoft.com/office/drawing/2016/5/14/chartex" xmlns:mc="http://schemas.openxmlformats.org/markup-compatibility/2006" xmlns:aink="http://schemas.microsoft.com/office/drawing/2016/ink" xmlns:am3d="http://schemas.microsoft.com/office/drawing/2017/model3d" xmlns:o="urn:schemas-microsoft-com:office:office" xmlns:oel="http://schemas.microsoft.com/office/2019/extlst" xmlns:r="http://schemas.openxmlformats.org/officeDocument/2006/relationships" xmlns:m="http://schemas.openxmlformats.org/officeDocument/2006/math" xmlns:v="urn:schemas-microsoft-com:vml" xmlns:wp14="http://schemas.microsoft.com/office/word/2010/wordprocessingDrawing" xmlns:wp="http://schemas.openxmlformats.org/drawingml/2006/wordprocessingDrawing" xmlns:w10="urn:schemas-microsoft-com:office:word" xmlns:w="http://schemas.openxmlformats.org/wordprocessingml/2006/main" xmlns:w14="http://schemas.microsoft.com/office/word/2010/wordml" xmlns:w15="http://schemas.microsoft.com/office/word/2012/wordml" xmlns:w16cex="http://schemas.microsoft.com/office/word/2018/wordml/cex" xmlns:w16cid="http://schemas.microsoft.com/office/word/2016/wordml/cid" xmlns:w16="http://schemas.microsoft.com/office/word/2018/wordml" xmlns:w16du="http://schemas.microsoft.com/office/word/2023/wordml/word16du" xmlns:w16sdtdh="http://schemas.microsoft.com/office/word/2020/wordml/sdtdatahash" xmlns:w16sdtfl="http://schemas.microsoft.com/office/word/2024/wordml/sdtformatlock" xmlns:w16se="http://schemas.microsoft.com/office/word/2015/wordml/symex" xmlns:wpg="http://schemas.microsoft.com/office/word/2010/wordprocessingGroup" xmlns:wpi="http://schemas.microsoft.com/office/word/2010/wordprocessingInk" xmlns:wne="http://schemas.microsoft.com/office/word/2006/wordml" xmlns:wps="http://schemas.microsoft.com/office/word/2010/wordprocessingShape" mc:Ignorable="w14 w15 w16se w16cid w16 w16cex w16sdtdh w16sdtfl w16du wp14">
   <w:body>
     <w:p>
       <w:pPr>
@@ -9,6 +9,7 @@
         <w:rPr>
           <w:b/>
           <w:bCs/>
+          <w:lang w:val="ru-RU"/>
         </w:rPr>
       </w:pPr>
       <w:r>
@@ -27,7 +28,13 @@
         <w:t>Python</w:t>
       </w:r>
     </w:p>
-    <w:p/>
+    <w:p>
+      <w:pPr>
+        <w:rPr>
+          <w:lang w:val="ru-RU"/>
+        </w:rPr>
+      </w:pPr>
+    </w:p>
     <w:p>
       <w:pPr>
         <w:rPr>
@@ -66,26 +73,199 @@
     <w:p>
       <w:pPr>
         <w:rPr>
-          <w:lang w:val="uk-UA"/>
-        </w:rPr>
-      </w:pPr>
-      <w:r>
-        <w:rPr>
-          <w:lang w:val="uk-UA"/>
-        </w:rPr>
-        <w:t xml:space="preserve">Під час виконання практичного завдання до Теми </w:t>
-      </w:r>
-      <w:r>
-        <w:rPr>
-          <w:lang w:val="uk-UA"/>
-        </w:rPr>
-        <w:t>№</w:t>
-      </w:r>
-      <w:r>
-        <w:rPr>
-          <w:lang w:val="uk-UA"/>
-        </w:rPr>
-        <w:t>1 було надано варіанти рішення до наступних задач:</w:t>
+          <w:lang w:val="ru-RU"/>
+        </w:rPr>
+      </w:pPr>
+      <w:proofErr w:type="spellStart"/>
+      <w:r>
+        <w:rPr>
+          <w:lang w:val="ru-RU"/>
+        </w:rPr>
+        <w:t>Під</w:t>
+      </w:r>
+      <w:proofErr w:type="spellEnd"/>
+      <w:r>
+        <w:rPr>
+          <w:lang w:val="ru-RU"/>
+        </w:rPr>
+        <w:t xml:space="preserve"> час </w:t>
+      </w:r>
+      <w:proofErr w:type="spellStart"/>
+      <w:r>
+        <w:rPr>
+          <w:lang w:val="ru-RU"/>
+        </w:rPr>
+        <w:t>практичної</w:t>
+      </w:r>
+      <w:proofErr w:type="spellEnd"/>
+      <w:r>
+        <w:rPr>
+          <w:lang w:val="ru-RU"/>
+        </w:rPr>
+        <w:t xml:space="preserve"> </w:t>
+      </w:r>
+      <w:proofErr w:type="spellStart"/>
+      <w:r>
+        <w:rPr>
+          <w:lang w:val="ru-RU"/>
+        </w:rPr>
+        <w:t>роботи</w:t>
+      </w:r>
+      <w:proofErr w:type="spellEnd"/>
+      <w:r>
+        <w:rPr>
+          <w:lang w:val="ru-RU"/>
+        </w:rPr>
+        <w:t xml:space="preserve"> за Темою №1 </w:t>
+      </w:r>
+      <w:proofErr w:type="spellStart"/>
+      <w:r>
+        <w:rPr>
+          <w:lang w:val="ru-RU"/>
+        </w:rPr>
+        <w:t>було</w:t>
+      </w:r>
+      <w:proofErr w:type="spellEnd"/>
+      <w:r>
+        <w:rPr>
+          <w:lang w:val="ru-RU"/>
+        </w:rPr>
+        <w:t xml:space="preserve"> </w:t>
+      </w:r>
+      <w:proofErr w:type="spellStart"/>
+      <w:r>
+        <w:rPr>
+          <w:lang w:val="ru-RU"/>
+        </w:rPr>
+        <w:t>реалізовано</w:t>
+      </w:r>
+      <w:proofErr w:type="spellEnd"/>
+      <w:r>
+        <w:rPr>
+          <w:lang w:val="ru-RU"/>
+        </w:rPr>
+        <w:t xml:space="preserve"> три </w:t>
+      </w:r>
+      <w:proofErr w:type="spellStart"/>
+      <w:r>
+        <w:rPr>
+          <w:lang w:val="ru-RU"/>
+        </w:rPr>
+        <w:t>програмні</w:t>
+      </w:r>
+      <w:proofErr w:type="spellEnd"/>
+      <w:r>
+        <w:rPr>
+          <w:lang w:val="ru-RU"/>
+        </w:rPr>
+        <w:t xml:space="preserve"> </w:t>
+      </w:r>
+      <w:proofErr w:type="spellStart"/>
+      <w:r>
+        <w:rPr>
+          <w:lang w:val="ru-RU"/>
+        </w:rPr>
+        <w:t>рішення</w:t>
+      </w:r>
+      <w:proofErr w:type="spellEnd"/>
+      <w:r>
+        <w:rPr>
+          <w:lang w:val="ru-RU"/>
+        </w:rPr>
+        <w:t xml:space="preserve">, </w:t>
+      </w:r>
+      <w:proofErr w:type="spellStart"/>
+      <w:r>
+        <w:rPr>
+          <w:lang w:val="ru-RU"/>
+        </w:rPr>
+        <w:t>які</w:t>
+      </w:r>
+      <w:proofErr w:type="spellEnd"/>
+      <w:r>
+        <w:rPr>
+          <w:lang w:val="ru-RU"/>
+        </w:rPr>
+        <w:t xml:space="preserve"> </w:t>
+      </w:r>
+      <w:proofErr w:type="spellStart"/>
+      <w:r>
+        <w:rPr>
+          <w:lang w:val="ru-RU"/>
+        </w:rPr>
+        <w:t>охоплюють</w:t>
+      </w:r>
+      <w:proofErr w:type="spellEnd"/>
+      <w:r>
+        <w:rPr>
+          <w:lang w:val="ru-RU"/>
+        </w:rPr>
+        <w:t xml:space="preserve"> </w:t>
+      </w:r>
+      <w:proofErr w:type="spellStart"/>
+      <w:r>
+        <w:rPr>
+          <w:lang w:val="ru-RU"/>
+        </w:rPr>
+        <w:t>базову</w:t>
+      </w:r>
+      <w:proofErr w:type="spellEnd"/>
+      <w:r>
+        <w:rPr>
+          <w:lang w:val="ru-RU"/>
+        </w:rPr>
+        <w:t xml:space="preserve"> роботу з </w:t>
+      </w:r>
+      <w:proofErr w:type="spellStart"/>
+      <w:r>
+        <w:rPr>
+          <w:lang w:val="ru-RU"/>
+        </w:rPr>
+        <w:t>функціями</w:t>
+      </w:r>
+      <w:proofErr w:type="spellEnd"/>
+      <w:r>
+        <w:rPr>
+          <w:lang w:val="ru-RU"/>
+        </w:rPr>
+        <w:t xml:space="preserve">, параметрами та </w:t>
+      </w:r>
+      <w:proofErr w:type="spellStart"/>
+      <w:r>
+        <w:rPr>
+          <w:lang w:val="ru-RU"/>
+        </w:rPr>
+        <w:t>змінними</w:t>
+      </w:r>
+      <w:proofErr w:type="spellEnd"/>
+      <w:r>
+        <w:rPr>
+          <w:lang w:val="ru-RU"/>
+        </w:rPr>
+        <w:t xml:space="preserve"> у </w:t>
+      </w:r>
+      <w:proofErr w:type="spellStart"/>
+      <w:r>
+        <w:rPr>
+          <w:lang w:val="ru-RU"/>
+        </w:rPr>
+        <w:t>мові</w:t>
+      </w:r>
+      <w:proofErr w:type="spellEnd"/>
+      <w:r>
+        <w:rPr>
+          <w:lang w:val="ru-RU"/>
+        </w:rPr>
+        <w:t xml:space="preserve"> </w:t>
+      </w:r>
+      <w:r>
+        <w:t>Python</w:t>
+      </w:r>
+      <w:r>
+        <w:rPr>
+          <w:lang w:val="ru-RU"/>
+        </w:rPr>
+        <w:t>.</w:t>
       </w:r>
     </w:p>
     <w:p>
@@ -128,13 +308,7 @@
         <w:rPr>
           <w:lang w:val="uk-UA"/>
         </w:rPr>
-        <w:t xml:space="preserve"> перетворити наступним </w:t>
-      </w:r>
-      <w:r>
-        <w:rPr>
-          <w:lang w:val="uk-UA"/>
-        </w:rPr>
-        <w:t xml:space="preserve">чином </w:t>
+        <w:t xml:space="preserve"> перетворити наступним чином </w:t>
       </w:r>
       <w:r>
         <w:rPr>
@@ -185,7 +359,7 @@
     </w:p>
     <w:tbl>
       <w:tblPr>
-        <w:tblStyle w:val="TableGrid"/>
+        <w:tblStyle w:val="a3"/>
         <w:tblW w:w="0" w:type="auto"/>
         <w:tblInd w:w="805" w:type="dxa"/>
         <w:tblLook w:val="04A0" w:firstRow="1" w:lastRow="0" w:firstColumn="1" w:lastColumn="0" w:noHBand="0" w:noVBand="1"/>
@@ -274,6 +448,13 @@
         <w:t>:</w:t>
       </w:r>
     </w:p>
+    <w:p>
+      <w:pPr>
+        <w:rPr>
+          <w:lang w:val="ru-RU"/>
+        </w:rPr>
+      </w:pPr>
+    </w:p>
     <w:sectPr>
       <w:pgSz w:w="12240" w:h="15840"/>
       <w:pgMar w:top="1440" w:right="1440" w:bottom="1440" w:left="1440" w:header="720" w:footer="720" w:gutter="0"/>
@@ -285,7 +466,7 @@
 </file>
 
 <file path=word/styles.xml><?xml version="1.0" encoding="utf-8"?>
-<w:styles xmlns:mc="http://schemas.openxmlformats.org/markup-compatibility/2006" xmlns:r="http://schemas.openxmlformats.org/officeDocument/2006/relationships" xmlns:w="http://schemas.openxmlformats.org/wordprocessingml/2006/main" xmlns:w14="http://schemas.microsoft.com/office/word/2010/wordml" xmlns:w15="http://schemas.microsoft.com/office/word/2012/wordml" xmlns:w16cex="http://schemas.microsoft.com/office/word/2018/wordml/cex" xmlns:w16cid="http://schemas.microsoft.com/office/word/2016/wordml/cid" xmlns:w16="http://schemas.microsoft.com/office/word/2018/wordml" xmlns:w16sdtdh="http://schemas.microsoft.com/office/word/2020/wordml/sdtdatahash" xmlns:w16se="http://schemas.microsoft.com/office/word/2015/wordml/symex" mc:Ignorable="w14 w15 w16se w16cid w16 w16cex w16sdtdh">
+<w:styles xmlns:mc="http://schemas.openxmlformats.org/markup-compatibility/2006" xmlns:r="http://schemas.openxmlformats.org/officeDocument/2006/relationships" xmlns:w="http://schemas.openxmlformats.org/wordprocessingml/2006/main" xmlns:w14="http://schemas.microsoft.com/office/word/2010/wordml" xmlns:w15="http://schemas.microsoft.com/office/word/2012/wordml" xmlns:w16cex="http://schemas.microsoft.com/office/word/2018/wordml/cex" xmlns:w16cid="http://schemas.microsoft.com/office/word/2016/wordml/cid" xmlns:w16="http://schemas.microsoft.com/office/word/2018/wordml" xmlns:w16du="http://schemas.microsoft.com/office/word/2023/wordml/word16du" xmlns:w16sdtdh="http://schemas.microsoft.com/office/word/2020/wordml/sdtdatahash" xmlns:w16sdtfl="http://schemas.microsoft.com/office/word/2024/wordml/sdtformatlock" xmlns:w16se="http://schemas.microsoft.com/office/word/2015/wordml/symex" mc:Ignorable="w14 w15 w16se w16cid w16 w16cex w16sdtdh w16sdtfl w16du">
   <w:docDefaults>
     <w:rPrDefault>
       <w:rPr>
@@ -679,7 +860,7 @@
     <w:lsdException w:name="Unresolved Mention" w:semiHidden="1" w:unhideWhenUsed="1"/>
     <w:lsdException w:name="Smart Link" w:semiHidden="1" w:unhideWhenUsed="1"/>
   </w:latentStyles>
-  <w:style w:type="paragraph" w:default="1" w:styleId="Normal">
+  <w:style w:type="paragraph" w:default="1" w:styleId="a">
     <w:name w:val="Normal"/>
     <w:qFormat/>
     <w:rsid w:val="0046193E"/>
@@ -693,13 +874,13 @@
       <w:sz w:val="28"/>
     </w:rPr>
   </w:style>
-  <w:style w:type="character" w:default="1" w:styleId="DefaultParagraphFont">
+  <w:style w:type="character" w:default="1" w:styleId="a0">
     <w:name w:val="Default Paragraph Font"/>
     <w:uiPriority w:val="1"/>
     <w:semiHidden/>
     <w:unhideWhenUsed/>
   </w:style>
-  <w:style w:type="table" w:default="1" w:styleId="TableNormal">
+  <w:style w:type="table" w:default="1" w:styleId="a1">
     <w:name w:val="Normal Table"/>
     <w:uiPriority w:val="99"/>
     <w:semiHidden/>
@@ -714,15 +895,15 @@
       </w:tblCellMar>
     </w:tblPr>
   </w:style>
-  <w:style w:type="numbering" w:default="1" w:styleId="NoList">
+  <w:style w:type="numbering" w:default="1" w:styleId="a2">
     <w:name w:val="No List"/>
     <w:uiPriority w:val="99"/>
     <w:semiHidden/>
     <w:unhideWhenUsed/>
   </w:style>
-  <w:style w:type="table" w:styleId="TableGrid">
+  <w:style w:type="table" w:styleId="a3">
     <w:name w:val="Table Grid"/>
-    <w:basedOn w:val="TableNormal"/>
+    <w:basedOn w:val="a1"/>
     <w:uiPriority w:val="39"/>
     <w:rsid w:val="00734561"/>
     <w:pPr>

</xml_diff>